<commit_message>
plan and projects is updated
</commit_message>
<xml_diff>
--- a/front end plan.docx
+++ b/front end plan.docx
@@ -54,32 +54,6 @@
               <w:t>Tasks</w:t>
             </w:r>
           </w:p>
-        </w:tc>
-      </w:tr>
-      <w:tr>
-        <w:tc>
-          <w:tcPr>
-            <w:tcW w:w="2337" w:type="dxa"/>
-          </w:tcPr>
-          <w:p/>
-        </w:tc>
-        <w:tc>
-          <w:tcPr>
-            <w:tcW w:w="2337" w:type="dxa"/>
-          </w:tcPr>
-          <w:p/>
-        </w:tc>
-        <w:tc>
-          <w:tcPr>
-            <w:tcW w:w="2338" w:type="dxa"/>
-          </w:tcPr>
-          <w:p/>
-        </w:tc>
-        <w:tc>
-          <w:tcPr>
-            <w:tcW w:w="2338" w:type="dxa"/>
-          </w:tcPr>
-          <w:p/>
         </w:tc>
       </w:tr>
       <w:tr>

</xml_diff>